<commit_message>
Update patent documents and HTML summaries with detailed specifications and enhancements
- Updated binary files for patent candidates summary, WSI viewer adaptive tile streaming, quantitative AI result visualization, virtual stain overlay method, and AI-assisted WSI annotation workflow.
- Enhanced HTML summaries with additional sections detailing specific control conditions, data structures, and operational procedures for improved clarity and comprehensiveness.
- Added new subsections addressing inline generation conditions, queue load assessment, priority score calculation, and user correction handling in the respective HTML documents.
</commit_message>
<xml_diff>
--- a/patent/docx/00_patent_candidates_summary.docx
+++ b/patent/docx/00_patent_candidates_summary.docx
@@ -366,6 +366,17 @@
     </w:p>
     <w:p>
       <w:pPr>
+        <w:numPr>
+          <w:ilvl w:val="0"/>
+          <w:numId w:val="1"/>
+        </w:numPr>
+      </w:pPr>
+      <w:r>
+        <w:t xml:space="preserve">inline generation 허용 조건, queue 부하 판단 기준, priority score, tile level별 timeout, generation id 폐기 규칙, multi-user priority 충돌 처리 규칙</w:t>
+      </w:r>
+    </w:p>
+    <w:p>
+      <w:pPr>
         <w:pStyle w:val="Heading2"/>
       </w:pPr>
       <w:r>
@@ -448,6 +459,17 @@
     </w:p>
     <w:p>
       <w:pPr>
+        <w:numPr>
+          <w:ilvl w:val="0"/>
+          <w:numId w:val="1"/>
+        </w:numPr>
+      </w:pPr>
+      <w:r>
+        <w:t xml:space="preserve">patch 크기 및 overlap 결정, blending weight 수식, MPP 차이 보정, source signature 기반 cache invalidation, 부분 추론 결과의 tile 단위 우선 표시</w:t>
+      </w:r>
+    </w:p>
+    <w:p>
+      <w:pPr>
         <w:pStyle w:val="Heading2"/>
       </w:pPr>
       <w:r>
@@ -485,6 +507,69 @@
       </w:pPr>
       <w:r>
         <w:t xml:space="preserve">사용자 수정 이력, undo/redo, audit, AI 결과 보정 데이터를 후속 분석에 반영하는 구성</w:t>
+      </w:r>
+    </w:p>
+    <w:p>
+      <w:pPr>
+        <w:numPr>
+          <w:ilvl w:val="0"/>
+          <w:numId w:val="1"/>
+        </w:numPr>
+      </w:pPr>
+      <w:r>
+        <w:t xml:space="preserve">correction dataset, QA status, re-review queue, retraining export, AI-human difference statistics, worker audit report 등 실제 갱신 데이터</w:t>
+      </w:r>
+    </w:p>
+    <w:p>
+      <w:pPr>
+        <w:pStyle w:val="Heading2"/>
+      </w:pPr>
+      <w:r>
+        <w:t xml:space="preserve">3.5 대규모 병리 AI 정량 결과의 실시간 시각화 방법의 보강 포인트</w:t>
+      </w:r>
+    </w:p>
+    <w:p>
+      <w:pPr>
+        <w:numPr>
+          <w:ilvl w:val="0"/>
+          <w:numId w:val="1"/>
+        </w:numPr>
+      </w:pPr>
+      <w:r>
+        <w:t xml:space="preserve">낮은 배율에서는 aggregate 또는 heatmap, 높은 배율에서는 cell bbox 또는 point로 전환하는 단계별 표현</w:t>
+      </w:r>
+    </w:p>
+    <w:p>
+      <w:pPr>
+        <w:numPr>
+          <w:ilvl w:val="0"/>
+          <w:numId w:val="1"/>
+        </w:numPr>
+      </w:pPr>
+      <w:r>
+        <w:t xml:space="preserve">patch, cell, heatmap, biomarker score를 동일 WSI 좌표계에서 연동 표시하는 구성</w:t>
+      </w:r>
+    </w:p>
+    <w:p>
+      <w:pPr>
+        <w:numPr>
+          <w:ilvl w:val="0"/>
+          <w:numId w:val="1"/>
+        </w:numPr>
+      </w:pPr>
+      <w:r>
+        <w:t xml:space="preserve">confidence/class filter 변경 시 spatial index를 재생성하지 않고 rendering 조건만 갱신하는 구성</w:t>
+      </w:r>
+    </w:p>
+    <w:p>
+      <w:pPr>
+        <w:numPr>
+          <w:ilvl w:val="0"/>
+          <w:numId w:val="1"/>
+        </w:numPr>
+      </w:pPr>
+      <w:r>
+        <w:t xml:space="preserve">사용자 correction 발생 시 전체 index rebuild 없이 해당 bucket만 부분 갱신하는 구성</w:t>
       </w:r>
     </w:p>
     <w:p>

</xml_diff>